<commit_message>
Unit 4: Security Mechanisms
</commit_message>
<xml_diff>
--- a/CS 3306 - Databases 2/Week 3/Assignments/Learning Journal Unit 3.docx
+++ b/CS 3306 - Databases 2/Week 3/Assignments/Learning Journal Unit 3.docx
@@ -58,13 +58,7 @@
         <w:bidi w:val="0"/>
         <w:spacing w:lineRule="auto" w:line="480" w:before="0" w:after="140"/>
         <w:jc w:val="center"/>
-        <w:rPr>
-          <w:rFonts w:ascii="Times New Roman" w:hAnsi="Times New Roman"/>
-          <w:b w:val="false"/>
-          <w:bCs w:val="false"/>
-          <w:sz w:val="24"/>
-          <w:szCs w:val="24"/>
-        </w:rPr>
+        <w:rPr/>
       </w:pPr>
       <w:r>
         <w:rPr>
@@ -240,11 +234,7 @@
         <w:spacing w:lineRule="auto" w:line="480" w:before="0" w:after="0"/>
         <w:ind w:hanging="0" w:start="0" w:end="0"/>
         <w:jc w:val="center"/>
-        <w:rPr>
-          <w:rFonts w:ascii="Times New Roman" w:hAnsi="Times New Roman"/>
-          <w:sz w:val="24"/>
-          <w:szCs w:val="24"/>
-        </w:rPr>
+        <w:rPr/>
       </w:pPr>
       <w:r>
         <w:rPr>
@@ -273,11 +263,7 @@
         <w:spacing w:lineRule="auto" w:line="480" w:before="0" w:after="0"/>
         <w:ind w:hanging="0" w:start="0" w:end="0"/>
         <w:jc w:val="center"/>
-        <w:rPr>
-          <w:rFonts w:ascii="Times New Roman" w:hAnsi="Times New Roman"/>
-          <w:sz w:val="24"/>
-          <w:szCs w:val="24"/>
-        </w:rPr>
+        <w:rPr/>
       </w:pPr>
       <w:r>
         <w:rPr>
@@ -306,11 +292,7 @@
         <w:spacing w:lineRule="auto" w:line="480" w:before="0" w:after="0"/>
         <w:ind w:hanging="0" w:start="0" w:end="0"/>
         <w:jc w:val="center"/>
-        <w:rPr>
-          <w:rFonts w:ascii="Times New Roman" w:hAnsi="Times New Roman"/>
-          <w:sz w:val="24"/>
-          <w:szCs w:val="24"/>
-        </w:rPr>
+        <w:rPr/>
       </w:pPr>
       <w:r>
         <w:rPr>
@@ -339,11 +321,7 @@
         <w:spacing w:lineRule="auto" w:line="480" w:before="0" w:after="0"/>
         <w:ind w:hanging="0" w:start="0" w:end="0"/>
         <w:jc w:val="center"/>
-        <w:rPr>
-          <w:rFonts w:ascii="Times New Roman" w:hAnsi="Times New Roman"/>
-          <w:sz w:val="24"/>
-          <w:szCs w:val="24"/>
-        </w:rPr>
+        <w:rPr/>
       </w:pPr>
       <w:r>
         <w:rPr>
@@ -414,11 +392,7 @@
         <w:spacing w:lineRule="auto" w:line="480" w:before="0" w:after="0"/>
         <w:ind w:hanging="0" w:start="0" w:end="0"/>
         <w:jc w:val="center"/>
-        <w:rPr>
-          <w:rFonts w:ascii="Times New Roman" w:hAnsi="Times New Roman"/>
-          <w:sz w:val="24"/>
-          <w:szCs w:val="24"/>
-        </w:rPr>
+        <w:rPr/>
       </w:pPr>
       <w:r>
         <w:rPr>
@@ -489,11 +463,7 @@
         <w:spacing w:lineRule="auto" w:line="480" w:before="0" w:after="0"/>
         <w:ind w:hanging="0" w:start="0" w:end="0"/>
         <w:jc w:val="center"/>
-        <w:rPr>
-          <w:rFonts w:ascii="Times New Roman" w:hAnsi="Times New Roman"/>
-          <w:sz w:val="24"/>
-          <w:szCs w:val="24"/>
-        </w:rPr>
+        <w:rPr/>
       </w:pPr>
       <w:r>
         <w:rPr>
@@ -522,11 +492,7 @@
         <w:spacing w:lineRule="auto" w:line="480" w:before="0" w:after="0"/>
         <w:ind w:hanging="0" w:start="0" w:end="0"/>
         <w:jc w:val="center"/>
-        <w:rPr>
-          <w:rFonts w:ascii="Times New Roman" w:hAnsi="Times New Roman"/>
-          <w:sz w:val="24"/>
-          <w:szCs w:val="24"/>
-        </w:rPr>
+        <w:rPr/>
       </w:pPr>
       <w:r>
         <w:rPr>
@@ -597,11 +563,7 @@
         <w:spacing w:lineRule="auto" w:line="480" w:before="0" w:after="0"/>
         <w:ind w:hanging="0" w:start="0" w:end="0"/>
         <w:jc w:val="center"/>
-        <w:rPr>
-          <w:rFonts w:ascii="Times New Roman" w:hAnsi="Times New Roman"/>
-          <w:sz w:val="24"/>
-          <w:szCs w:val="24"/>
-        </w:rPr>
+        <w:rPr/>
       </w:pPr>
       <w:r>
         <w:rPr>
@@ -756,11 +718,7 @@
         <w:spacing w:lineRule="auto" w:line="480" w:before="0" w:after="0"/>
         <w:ind w:hanging="0" w:start="0" w:end="0"/>
         <w:jc w:val="center"/>
-        <w:rPr>
-          <w:rFonts w:ascii="Times New Roman" w:hAnsi="Times New Roman"/>
-          <w:sz w:val="24"/>
-          <w:szCs w:val="24"/>
-        </w:rPr>
+        <w:rPr/>
       </w:pPr>
       <w:r>
         <w:rPr>
@@ -778,43 +736,7 @@
           <w:effect w:val="none"/>
           <w:shd w:fill="auto" w:val="clear"/>
         </w:rPr>
-        <w:t xml:space="preserve">April </w:t>
-      </w:r>
-      <w:r>
-        <w:rPr>
-          <w:rFonts w:ascii="Times New Roman" w:hAnsi="Times New Roman"/>
-          <w:b w:val="false"/>
-          <w:i w:val="false"/>
-          <w:caps w:val="false"/>
-          <w:smallCaps w:val="false"/>
-          <w:strike w:val="false"/>
-          <w:dstrike w:val="false"/>
-          <w:color w:val="000000"/>
-          <w:sz w:val="24"/>
-          <w:szCs w:val="24"/>
-          <w:u w:val="none"/>
-          <w:effect w:val="none"/>
-          <w:shd w:fill="auto" w:val="clear"/>
-        </w:rPr>
-        <w:t>30th</w:t>
-      </w:r>
-      <w:r>
-        <w:rPr>
-          <w:rFonts w:ascii="Times New Roman" w:hAnsi="Times New Roman"/>
-          <w:b w:val="false"/>
-          <w:i w:val="false"/>
-          <w:caps w:val="false"/>
-          <w:smallCaps w:val="false"/>
-          <w:strike w:val="false"/>
-          <w:dstrike w:val="false"/>
-          <w:color w:val="000000"/>
-          <w:sz w:val="24"/>
-          <w:szCs w:val="24"/>
-          <w:u w:val="none"/>
-          <w:effect w:val="none"/>
-          <w:shd w:fill="auto" w:val="clear"/>
-        </w:rPr>
-        <w:t xml:space="preserve"> 2026</w:t>
+        <w:t>April 30th 2026</w:t>
       </w:r>
     </w:p>
     <w:p>
@@ -1103,9 +1025,7 @@
       </w:pPr>
       <w:r>
         <w:rPr>
-          <w:rFonts w:ascii="Times New Roman" w:hAnsi="Times New Roman"/>
-          <w:sz w:val="24"/>
-          <w:szCs w:val="24"/>
+          <w:b/>
         </w:rPr>
       </w:r>
     </w:p>
@@ -1228,35 +1148,7 @@
           <w:sz w:val="24"/>
           <w:szCs w:val="24"/>
         </w:rPr>
-        <w:t>OpenCart. (2026</w:t>
-      </w:r>
-      <w:r>
-        <w:rPr>
-          <w:rFonts w:ascii="Times New Roman" w:hAnsi="Times New Roman"/>
-          <w:b w:val="false"/>
-          <w:i w:val="false"/>
-          <w:caps w:val="false"/>
-          <w:smallCaps w:val="false"/>
-          <w:color w:val="1C1D1F"/>
-          <w:spacing w:val="0"/>
-          <w:sz w:val="24"/>
-          <w:szCs w:val="24"/>
-        </w:rPr>
-        <w:t>a</w:t>
-      </w:r>
-      <w:r>
-        <w:rPr>
-          <w:rFonts w:ascii="Times New Roman" w:hAnsi="Times New Roman"/>
-          <w:b w:val="false"/>
-          <w:i w:val="false"/>
-          <w:caps w:val="false"/>
-          <w:smallCaps w:val="false"/>
-          <w:color w:val="1C1D1F"/>
-          <w:spacing w:val="0"/>
-          <w:sz w:val="24"/>
-          <w:szCs w:val="24"/>
-        </w:rPr>
-        <w:t xml:space="preserve">). </w:t>
+        <w:t xml:space="preserve">OpenCart. (2026a). </w:t>
       </w:r>
       <w:r>
         <w:rPr>
@@ -1335,63 +1227,7 @@
           <w:sz w:val="24"/>
           <w:szCs w:val="24"/>
         </w:rPr>
-        <w:t xml:space="preserve">OpenCart. </w:t>
-      </w:r>
-      <w:r>
-        <w:rPr>
-          <w:rFonts w:ascii="Times New Roman" w:hAnsi="Times New Roman"/>
-          <w:b w:val="false"/>
-          <w:i w:val="false"/>
-          <w:caps w:val="false"/>
-          <w:smallCaps w:val="false"/>
-          <w:color w:val="1C1D1F"/>
-          <w:spacing w:val="0"/>
-          <w:sz w:val="24"/>
-          <w:szCs w:val="24"/>
-        </w:rPr>
-        <w:t>(</w:t>
-      </w:r>
-      <w:r>
-        <w:rPr>
-          <w:rFonts w:ascii="Times New Roman" w:hAnsi="Times New Roman"/>
-          <w:b w:val="false"/>
-          <w:i w:val="false"/>
-          <w:caps w:val="false"/>
-          <w:smallCaps w:val="false"/>
-          <w:color w:val="1C1D1F"/>
-          <w:spacing w:val="0"/>
-          <w:sz w:val="24"/>
-          <w:szCs w:val="24"/>
-        </w:rPr>
-        <w:t>2026</w:t>
-      </w:r>
-      <w:r>
-        <w:rPr>
-          <w:rFonts w:ascii="Times New Roman" w:hAnsi="Times New Roman"/>
-          <w:b w:val="false"/>
-          <w:i w:val="false"/>
-          <w:caps w:val="false"/>
-          <w:smallCaps w:val="false"/>
-          <w:color w:val="1C1D1F"/>
-          <w:spacing w:val="0"/>
-          <w:sz w:val="24"/>
-          <w:szCs w:val="24"/>
-        </w:rPr>
-        <w:t>b</w:t>
-      </w:r>
-      <w:r>
-        <w:rPr>
-          <w:rFonts w:ascii="Times New Roman" w:hAnsi="Times New Roman"/>
-          <w:b w:val="false"/>
-          <w:i w:val="false"/>
-          <w:caps w:val="false"/>
-          <w:smallCaps w:val="false"/>
-          <w:color w:val="1C1D1F"/>
-          <w:spacing w:val="0"/>
-          <w:sz w:val="24"/>
-          <w:szCs w:val="24"/>
-        </w:rPr>
-        <w:t xml:space="preserve">). </w:t>
+        <w:t xml:space="preserve">OpenCart. (2026b). </w:t>
       </w:r>
       <w:r>
         <w:rPr>
@@ -1406,37 +1242,7 @@
           <w:sz w:val="24"/>
           <w:szCs w:val="24"/>
         </w:rPr>
-        <w:t xml:space="preserve">Database </w:t>
-      </w:r>
-      <w:r>
-        <w:rPr>
-          <w:rFonts w:ascii="Times New Roman" w:hAnsi="Times New Roman"/>
-          <w:b w:val="false"/>
-          <w:i/>
-          <w:iCs/>
-          <w:caps w:val="false"/>
-          <w:smallCaps w:val="false"/>
-          <w:color w:val="1C1D1F"/>
-          <w:spacing w:val="0"/>
-          <w:sz w:val="24"/>
-          <w:szCs w:val="24"/>
-        </w:rPr>
-        <w:t>s</w:t>
-      </w:r>
-      <w:r>
-        <w:rPr>
-          <w:rFonts w:ascii="Times New Roman" w:hAnsi="Times New Roman"/>
-          <w:b w:val="false"/>
-          <w:i/>
-          <w:iCs/>
-          <w:caps w:val="false"/>
-          <w:smallCaps w:val="false"/>
-          <w:color w:val="1C1D1F"/>
-          <w:spacing w:val="0"/>
-          <w:sz w:val="24"/>
-          <w:szCs w:val="24"/>
-        </w:rPr>
-        <w:t>chema.</w:t>
+        <w:t>Database schema.</w:t>
       </w:r>
       <w:r>
         <w:rPr>
@@ -1530,21 +1336,7 @@
           <w:sz w:val="24"/>
           <w:szCs w:val="24"/>
         </w:rPr>
-        <w:t> </w:t>
-      </w:r>
-      <w:r>
-        <w:rPr>
-          <w:rFonts w:ascii="Times New Roman" w:hAnsi="Times New Roman"/>
-          <w:b w:val="false"/>
-          <w:i w:val="false"/>
-          <w:caps w:val="false"/>
-          <w:smallCaps w:val="false"/>
-          <w:color w:val="1D2125"/>
-          <w:spacing w:val="0"/>
-          <w:sz w:val="24"/>
-          <w:szCs w:val="24"/>
-        </w:rPr>
-        <w:t>(4th ed.). New York, NY: McGraw-Hill.</w:t>
+        <w:t> (4th ed.). New York, NY: McGraw-Hill.</w:t>
       </w:r>
     </w:p>
     <w:p>
@@ -1693,9 +1485,6 @@
           <w:sz w:val="24"/>
           <w:szCs w:val="24"/>
         </w:rPr>
-        <w:br/>
-      </w:r>
-      <w:r>
         <mc:AlternateContent>
           <mc:Choice Requires="wps">
             <w:drawing>
@@ -1714,17 +1503,28 @@
                 <a:graphic xmlns:a="http://schemas.openxmlformats.org/drawingml/2006/main">
                   <a:graphicData uri="http://schemas.microsoft.com/office/word/2010/wordprocessingShape">
                     <wps:wsp>
-                      <wps:cNvSpPr txBox="1"/>
+                      <wps:cNvSpPr/>
                       <wps:spPr>
                         <a:xfrm>
                           <a:off x="0" y="0"/>
-                          <a:ext cx="6120130" cy="6769100"/>
+                          <a:ext cx="6120000" cy="6769080"/>
                         </a:xfrm>
-                        <a:prstGeom prst="rect"/>
+                        <a:prstGeom prst="rect">
+                          <a:avLst/>
+                        </a:prstGeom>
                         <a:solidFill>
                           <a:srgbClr val="FFFFFF"/>
                         </a:solidFill>
+                        <a:ln w="0">
+                          <a:noFill/>
+                        </a:ln>
                       </wps:spPr>
+                      <wps:style>
+                        <a:lnRef idx="0"/>
+                        <a:fillRef idx="0"/>
+                        <a:effectRef idx="0"/>
+                        <a:fontRef idx="minor"/>
+                      </wps:style>
                       <wps:txbx>
                         <w:txbxContent>
                           <w:p>
@@ -1738,11 +1538,7 @@
                               </w:rPr>
                             </w:pPr>
                             <w:r>
-                              <w:rPr>
-                                <w:rFonts w:ascii="Times New Roman" w:hAnsi="Times New Roman"/>
-                                <w:sz w:val="24"/>
-                                <w:szCs w:val="24"/>
-                              </w:rPr>
+                              <w:rPr/>
                               <w:drawing>
                                 <wp:inline distT="0" distB="0" distL="0" distR="0">
                                   <wp:extent cx="6120130" cy="6769100"/>
@@ -1781,6 +1577,13 @@
                                   </a:graphic>
                                 </wp:inline>
                               </w:drawing>
+                            </w:r>
+                            <w:r>
+                              <w:rPr>
+                                <w:rFonts w:ascii="Times New Roman" w:hAnsi="Times New Roman"/>
+                                <w:sz w:val="24"/>
+                                <w:szCs w:val="24"/>
+                              </w:rPr>
                               <w:t xml:space="preserve">Appendix </w:t>
                             </w:r>
                             <w:r>
@@ -1834,7 +1637,7 @@
                           </w:p>
                         </w:txbxContent>
                       </wps:txbx>
-                      <wps:bodyPr anchor="t" lIns="0" tIns="0" rIns="0" bIns="0">
+                      <wps:bodyPr lIns="0" tIns="0" rIns="0" bIns="0" anchor="t">
                         <a:noAutofit/>
                       </wps:bodyPr>
                     </wps:wsp>
@@ -1845,8 +1648,10 @@
           </mc:Choice>
           <mc:Fallback>
             <w:pict>
-              <v:rect style="position:absolute;rotation:-0;width:481.9pt;height:533pt;mso-wrap-distance-left:0pt;mso-wrap-distance-right:0pt;mso-wrap-distance-top:0pt;mso-wrap-distance-bottom:0pt;margin-top:0pt;mso-position-vertical:top;mso-position-vertical-relative:text;margin-left:0pt;mso-position-horizontal:center;mso-position-horizontal-relative:text">
-                <v:textbox inset="0in,0in,0in,0in">
+              <v:rect id="shape_0" fillcolor="white" stroked="f" o:allowincell="f" style="position:absolute;margin-left:0pt;margin-top:0.05pt;width:481.85pt;height:532.95pt;mso-wrap-style:square;v-text-anchor:top;mso-position-horizontal:center">
+                <v:fill o:detectmouseclick="t" type="solid" color2="black"/>
+                <v:stroke color="#3465a4" joinstyle="round" endcap="flat"/>
+                <v:textbox>
                   <w:txbxContent>
                     <w:p>
                       <w:pPr>
@@ -1859,11 +1664,7 @@
                         </w:rPr>
                       </w:pPr>
                       <w:r>
-                        <w:rPr>
-                          <w:rFonts w:ascii="Times New Roman" w:hAnsi="Times New Roman"/>
-                          <w:sz w:val="24"/>
-                          <w:szCs w:val="24"/>
-                        </w:rPr>
+                        <w:rPr/>
                         <w:drawing>
                           <wp:inline distT="0" distB="0" distL="0" distR="0">
                             <wp:extent cx="6120130" cy="6769100"/>
@@ -1902,6 +1703,13 @@
                             </a:graphic>
                           </wp:inline>
                         </w:drawing>
+                      </w:r>
+                      <w:r>
+                        <w:rPr>
+                          <w:rFonts w:ascii="Times New Roman" w:hAnsi="Times New Roman"/>
+                          <w:sz w:val="24"/>
+                          <w:szCs w:val="24"/>
+                        </w:rPr>
                         <w:t xml:space="preserve">Appendix </w:t>
                       </w:r>
                       <w:r>
@@ -1961,6 +1769,15 @@
           </mc:Fallback>
         </mc:AlternateContent>
       </w:r>
+      <w:r>
+        <w:rPr>
+          <w:rFonts w:ascii="Times New Roman" w:hAnsi="Times New Roman"/>
+          <w:color w:val="1D2125"/>
+          <w:sz w:val="24"/>
+          <w:szCs w:val="24"/>
+        </w:rPr>
+        <w:br/>
+      </w:r>
     </w:p>
     <w:sectPr>
       <w:type w:val="nextPage"/>
@@ -2327,8 +2144,8 @@
       <w:szCs w:val="28"/>
     </w:rPr>
   </w:style>
-  <w:style w:type="character" w:styleId="Bulletsuser">
-    <w:name w:val="Bullets (user)"/>
+  <w:style w:type="character" w:styleId="Bullets">
+    <w:name w:val="Bullets"/>
     <w:qFormat/>
     <w:rPr>
       <w:rFonts w:ascii="OpenSymbol" w:hAnsi="OpenSymbol" w:eastAsia="OpenSymbol" w:cs="OpenSymbol"/>
@@ -2349,8 +2166,8 @@
       <w:bCs/>
     </w:rPr>
   </w:style>
-  <w:style w:type="character" w:styleId="Bullets">
-    <w:name w:val="Bullets"/>
+  <w:style w:type="character" w:styleId="Bulletsuser">
+    <w:name w:val="Bullets (user)"/>
     <w:qFormat/>
     <w:rPr>
       <w:rFonts w:ascii="OpenSymbol" w:hAnsi="OpenSymbol" w:eastAsia="OpenSymbol" w:cs="OpenSymbol"/>
@@ -2517,8 +2334,8 @@
       <w:lang w:val="en-US" w:eastAsia="en-US" w:bidi="ar-SA"/>
     </w:rPr>
   </w:style>
-  <w:style w:type="paragraph" w:styleId="FrameContents">
-    <w:name w:val="Frame Contents"/>
+  <w:style w:type="paragraph" w:styleId="FrameContentsuser">
+    <w:name w:val="Frame Contents (user)"/>
     <w:basedOn w:val="Normal"/>
     <w:qFormat/>
     <w:pPr/>
@@ -2557,6 +2374,13 @@
       <w:sz w:val="32"/>
       <w:szCs w:val="32"/>
     </w:rPr>
+  </w:style>
+  <w:style w:type="paragraph" w:styleId="FrameContents">
+    <w:name w:val="Frame Contents"/>
+    <w:basedOn w:val="Normal"/>
+    <w:qFormat/>
+    <w:pPr/>
+    <w:rPr/>
   </w:style>
 </w:styles>
 </file>

</xml_diff>